<commit_message>
feat: claims ledger, vendor check, contract schemas and code owners
Add the claims ledger (docs/compliance/claims.toml, rendered to CLAIMS.md) and tools/ci/claims.sh, which holds every row to the files, lines, tests and criteria it cites. Add tools/ci/vendor-check.sh, which requires /vendor to be exactly the crates Cargo.lock names. Both run as CI jobs on GitHub and GitLab.

Add JSON schemas and fixtures for the import and ontology file contracts, with an http-gateway test that holds the parsers to them. Label the toolchain image with the Dockerfile it was built from so a stale image is replaced.

Add CODEOWNERS. Bring the README, guides, compliance and design documents into line with the ledger, and remove unused design fonts, tokens, uploads and superseded diagrams.
</commit_message>
<xml_diff>
--- a/docs/dev/documents/SAD_00_Midgard_Core.docx
+++ b/docs/dev/documents/SAD_00_Midgard_Core.docx
@@ -83,7 +83,7 @@
           <w:color w:val="0B4884"/>
           <w:sz w:val="20"/>
         </w:rPr>
-        <w:t>CONFIDENTIAL — RECIPIENT EYES ONLY</w:t>
+        <w:t>PUBLIC, published with the Midgard repository</w:t>
       </w:r>
     </w:p>
     <w:p>
@@ -476,7 +476,7 @@
               <w:rPr>
                 <w:sz w:val="19"/>
               </w:rPr>
-              <w:t>CONFIDENTIAL — RECIPIENT EYES ONLY</w:t>
+              <w:t>PUBLIC, published with the Midgard repository</w:t>
             </w:r>
           </w:p>
         </w:tc>
@@ -14446,7 +14446,7 @@
         <w:color w:val="595959"/>
         <w:sz w:val="14"/>
       </w:rPr>
-      <w:t>Akuma Engineering Ltd. — CONFIDENTIAL</w:t>
+      <w:t>Akuma Engineering Ltd. — PUBLIC</w:t>
     </w:r>
     <w:r>
       <w:tab/>

</xml_diff>